<commit_message>
minor changes in course note
</commit_message>
<xml_diff>
--- a/docs/12-final-report/Пояснительная записка.docx
+++ b/docs/12-final-report/Пояснительная записка.docx
@@ -1315,7 +1315,15 @@
           <w:szCs w:val="28"/>
           <w:lang w:eastAsia="ru-RU"/>
         </w:rPr>
-        <w:t>Ставрополь, 2025</w:t>
+        <w:t>Ставрополь, 202</w:t>
+      </w:r>
+      <w:r>
+        <w:rPr>
+          <w:rFonts w:eastAsia="Times New Roman" w:cs="Times New Roman"/>
+          <w:szCs w:val="28"/>
+          <w:lang w:val="en-US" w:eastAsia="ru-RU"/>
+        </w:rPr>
+        <w:t>6</w:t>
       </w:r>
       <w:r>
         <w:rPr>
@@ -8407,21 +8415,7 @@
         <w:rPr>
           <w:lang w:eastAsia="ru-RU"/>
         </w:rPr>
-        <w:t xml:space="preserve"> мобильная игра жанра выживания с широкой аудиторией, ключевой особенностью которой являются </w:t>
-      </w:r>
-      <w:proofErr w:type="spellStart"/>
-      <w:r>
-        <w:rPr>
-          <w:lang w:eastAsia="ru-RU"/>
-        </w:rPr>
-        <w:t>временны́е</w:t>
-      </w:r>
-      <w:proofErr w:type="spellEnd"/>
-      <w:r>
-        <w:rPr>
-          <w:lang w:eastAsia="ru-RU"/>
-        </w:rPr>
-        <w:t xml:space="preserve"> события, привязанные к реальному времени. Пропущенное событие влечёт потерю ресурсов и замедление игрового прогресса, однако официальное приложение не предоставляет полноценного механизма их отслеживания.</w:t>
+        <w:t xml:space="preserve"> мобильная игра жанра выживания с широкой аудиторией, ключевой особенностью которой являются временные события, привязанные к реальному времени. Пропущенное событие влечёт потерю ресурсов и замедление игрового прогресса, однако официальное приложение не предоставляет полноценного механизма их отслеживания.</w:t>
       </w:r>
     </w:p>
     <w:p>
@@ -9148,15 +9142,7 @@
         <w:t>-</w:t>
       </w:r>
       <w:r>
-        <w:t xml:space="preserve"> многопользовательской игры жанра выживания, в которой ключевые игровые процессы (производство ресурсов, строительство, восстановление) привязаны к реальному времени. Пользователям необходим инструмент, позволяющий создавать и отслеживать </w:t>
-      </w:r>
-      <w:proofErr w:type="spellStart"/>
-      <w:r>
-        <w:t>временны́е</w:t>
-      </w:r>
-      <w:proofErr w:type="spellEnd"/>
-      <w:r>
-        <w:t xml:space="preserve"> события с уведомлениями, просматривать справочную базу игрового контента и управлять шаблонами повторяющихся действий </w:t>
+        <w:t xml:space="preserve"> многопользовательской игры жанра выживания, в которой ключевые игровые процессы (производство ресурсов, строительство, восстановление) привязаны к реальному времени. Пользователям необходим инструмент, позволяющий создавать и отслеживать временные события с уведомлениями, просматривать справочную базу игрового контента и управлять шаблонами повторяющихся действий </w:t>
       </w:r>
       <w:r>
         <w:t>-</w:t>
@@ -13630,21 +13616,19 @@
                 <w:lang w:eastAsia="ru-RU"/>
                 <w14:ligatures w14:val="none"/>
               </w:rPr>
-              <w:t xml:space="preserve">180 000 </w:t>
-            </w:r>
-            <w:proofErr w:type="spellStart"/>
-            <w:r>
-              <w:rPr>
-                <w:rFonts w:eastAsia="Times New Roman" w:cs="Times New Roman"/>
-                <w:kern w:val="0"/>
-                <w:sz w:val="24"/>
-                <w:szCs w:val="24"/>
-                <w:lang w:eastAsia="ru-RU"/>
-                <w14:ligatures w14:val="none"/>
-              </w:rPr>
-              <w:t>руб</w:t>
-            </w:r>
-            <w:proofErr w:type="spellEnd"/>
+              <w:t>180 000 руб</w:t>
+            </w:r>
+            <w:r>
+              <w:rPr>
+                <w:rFonts w:eastAsia="Times New Roman" w:cs="Times New Roman"/>
+                <w:kern w:val="0"/>
+                <w:sz w:val="24"/>
+                <w:szCs w:val="24"/>
+                <w:lang w:eastAsia="ru-RU"/>
+                <w14:ligatures w14:val="none"/>
+              </w:rPr>
+              <w:t>.</w:t>
+            </w:r>
           </w:p>
         </w:tc>
       </w:tr>
@@ -15888,9 +15872,9 @@
       </w:tblPr>
       <w:tblGrid>
         <w:gridCol w:w="1695"/>
-        <w:gridCol w:w="1561"/>
-        <w:gridCol w:w="3540"/>
-        <w:gridCol w:w="2549"/>
+        <w:gridCol w:w="1703"/>
+        <w:gridCol w:w="3400"/>
+        <w:gridCol w:w="2547"/>
       </w:tblGrid>
       <w:tr>
         <w:trPr>
@@ -15931,7 +15915,7 @@
         </w:tc>
         <w:tc>
           <w:tcPr>
-            <w:tcW w:w="835" w:type="pct"/>
+            <w:tcW w:w="911" w:type="pct"/>
             <w:noWrap/>
             <w:vAlign w:val="center"/>
             <w:hideMark/>
@@ -15963,7 +15947,7 @@
         </w:tc>
         <w:tc>
           <w:tcPr>
-            <w:tcW w:w="1894" w:type="pct"/>
+            <w:tcW w:w="1819" w:type="pct"/>
             <w:noWrap/>
             <w:vAlign w:val="center"/>
             <w:hideMark/>
@@ -16066,7 +16050,7 @@
         </w:tc>
         <w:tc>
           <w:tcPr>
-            <w:tcW w:w="835" w:type="pct"/>
+            <w:tcW w:w="911" w:type="pct"/>
             <w:vAlign w:val="center"/>
             <w:hideMark/>
           </w:tcPr>
@@ -16099,7 +16083,7 @@
         </w:tc>
         <w:tc>
           <w:tcPr>
-            <w:tcW w:w="1894" w:type="pct"/>
+            <w:tcW w:w="1819" w:type="pct"/>
             <w:vAlign w:val="center"/>
             <w:hideMark/>
           </w:tcPr>
@@ -16224,7 +16208,7 @@
         </w:tc>
         <w:tc>
           <w:tcPr>
-            <w:tcW w:w="835" w:type="pct"/>
+            <w:tcW w:w="911" w:type="pct"/>
             <w:vAlign w:val="center"/>
             <w:hideMark/>
           </w:tcPr>
@@ -16257,7 +16241,7 @@
         </w:tc>
         <w:tc>
           <w:tcPr>
-            <w:tcW w:w="1894" w:type="pct"/>
+            <w:tcW w:w="1819" w:type="pct"/>
             <w:vAlign w:val="center"/>
             <w:hideMark/>
           </w:tcPr>
@@ -16395,7 +16379,7 @@
         </w:tc>
         <w:tc>
           <w:tcPr>
-            <w:tcW w:w="835" w:type="pct"/>
+            <w:tcW w:w="911" w:type="pct"/>
             <w:vAlign w:val="center"/>
             <w:hideMark/>
           </w:tcPr>
@@ -16428,7 +16412,7 @@
         </w:tc>
         <w:tc>
           <w:tcPr>
-            <w:tcW w:w="1894" w:type="pct"/>
+            <w:tcW w:w="1819" w:type="pct"/>
             <w:vAlign w:val="center"/>
             <w:hideMark/>
           </w:tcPr>
@@ -16614,7 +16598,7 @@
         </w:tc>
         <w:tc>
           <w:tcPr>
-            <w:tcW w:w="835" w:type="pct"/>
+            <w:tcW w:w="911" w:type="pct"/>
             <w:vAlign w:val="center"/>
             <w:hideMark/>
           </w:tcPr>
@@ -16647,7 +16631,7 @@
         </w:tc>
         <w:tc>
           <w:tcPr>
-            <w:tcW w:w="1894" w:type="pct"/>
+            <w:tcW w:w="1819" w:type="pct"/>
             <w:vAlign w:val="center"/>
             <w:hideMark/>
           </w:tcPr>
@@ -16808,7 +16792,7 @@
         </w:tc>
         <w:tc>
           <w:tcPr>
-            <w:tcW w:w="835" w:type="pct"/>
+            <w:tcW w:w="911" w:type="pct"/>
             <w:vAlign w:val="center"/>
           </w:tcPr>
           <w:p>
@@ -16840,7 +16824,7 @@
         </w:tc>
         <w:tc>
           <w:tcPr>
-            <w:tcW w:w="1894" w:type="pct"/>
+            <w:tcW w:w="1819" w:type="pct"/>
             <w:vAlign w:val="center"/>
           </w:tcPr>
           <w:p>
@@ -18406,11 +18390,12 @@
           <w:tcPr>
             <w:tcW w:w="0" w:type="auto"/>
             <w:noWrap/>
+            <w:vAlign w:val="center"/>
             <w:hideMark/>
           </w:tcPr>
           <w:p>
             <w:pPr>
-              <w:jc w:val="left"/>
+              <w:jc w:val="center"/>
               <w:rPr>
                 <w:rFonts w:eastAsia="Times New Roman" w:cs="Times New Roman"/>
                 <w:kern w:val="0"/>
@@ -18437,11 +18422,12 @@
           <w:tcPr>
             <w:tcW w:w="0" w:type="auto"/>
             <w:noWrap/>
+            <w:vAlign w:val="center"/>
             <w:hideMark/>
           </w:tcPr>
           <w:p>
             <w:pPr>
-              <w:jc w:val="left"/>
+              <w:jc w:val="center"/>
               <w:rPr>
                 <w:rFonts w:eastAsia="Times New Roman" w:cs="Times New Roman"/>
                 <w:kern w:val="0"/>
@@ -18468,11 +18454,12 @@
           <w:tcPr>
             <w:tcW w:w="4601" w:type="dxa"/>
             <w:noWrap/>
+            <w:vAlign w:val="center"/>
             <w:hideMark/>
           </w:tcPr>
           <w:p>
             <w:pPr>
-              <w:jc w:val="left"/>
+              <w:jc w:val="center"/>
               <w:rPr>
                 <w:rFonts w:eastAsia="Times New Roman" w:cs="Times New Roman"/>
                 <w:kern w:val="0"/>
@@ -18503,11 +18490,12 @@
         <w:tc>
           <w:tcPr>
             <w:tcW w:w="0" w:type="auto"/>
+            <w:vAlign w:val="center"/>
             <w:hideMark/>
           </w:tcPr>
           <w:p>
             <w:pPr>
-              <w:jc w:val="left"/>
+              <w:jc w:val="center"/>
               <w:rPr>
                 <w:rFonts w:eastAsia="Times New Roman" w:cs="Times New Roman"/>
                 <w:kern w:val="0"/>
@@ -18533,11 +18521,12 @@
         <w:tc>
           <w:tcPr>
             <w:tcW w:w="0" w:type="auto"/>
+            <w:vAlign w:val="center"/>
             <w:hideMark/>
           </w:tcPr>
           <w:p>
             <w:pPr>
-              <w:jc w:val="left"/>
+              <w:jc w:val="center"/>
               <w:rPr>
                 <w:rFonts w:eastAsia="Times New Roman" w:cs="Times New Roman"/>
                 <w:kern w:val="0"/>
@@ -18563,11 +18552,12 @@
         <w:tc>
           <w:tcPr>
             <w:tcW w:w="4601" w:type="dxa"/>
+            <w:vAlign w:val="center"/>
             <w:hideMark/>
           </w:tcPr>
           <w:p>
             <w:pPr>
-              <w:jc w:val="left"/>
+              <w:jc w:val="center"/>
               <w:rPr>
                 <w:rFonts w:eastAsia="Times New Roman" w:cs="Times New Roman"/>
                 <w:kern w:val="0"/>
@@ -18622,11 +18612,12 @@
         <w:tc>
           <w:tcPr>
             <w:tcW w:w="0" w:type="auto"/>
+            <w:vAlign w:val="center"/>
             <w:hideMark/>
           </w:tcPr>
           <w:p>
             <w:pPr>
-              <w:jc w:val="left"/>
+              <w:jc w:val="center"/>
               <w:rPr>
                 <w:rFonts w:eastAsia="Times New Roman" w:cs="Times New Roman"/>
                 <w:kern w:val="0"/>
@@ -18652,11 +18643,12 @@
         <w:tc>
           <w:tcPr>
             <w:tcW w:w="0" w:type="auto"/>
+            <w:vAlign w:val="center"/>
             <w:hideMark/>
           </w:tcPr>
           <w:p>
             <w:pPr>
-              <w:jc w:val="left"/>
+              <w:jc w:val="center"/>
               <w:rPr>
                 <w:rFonts w:eastAsia="Times New Roman" w:cs="Times New Roman"/>
                 <w:kern w:val="0"/>
@@ -18706,11 +18698,12 @@
         <w:tc>
           <w:tcPr>
             <w:tcW w:w="4601" w:type="dxa"/>
+            <w:vAlign w:val="center"/>
             <w:hideMark/>
           </w:tcPr>
           <w:p>
             <w:pPr>
-              <w:jc w:val="left"/>
+              <w:jc w:val="center"/>
               <w:rPr>
                 <w:rFonts w:eastAsia="Times New Roman" w:cs="Times New Roman"/>
                 <w:kern w:val="0"/>
@@ -18765,11 +18758,12 @@
         <w:tc>
           <w:tcPr>
             <w:tcW w:w="0" w:type="auto"/>
+            <w:vAlign w:val="center"/>
             <w:hideMark/>
           </w:tcPr>
           <w:p>
             <w:pPr>
-              <w:jc w:val="left"/>
+              <w:jc w:val="center"/>
               <w:rPr>
                 <w:rFonts w:eastAsia="Times New Roman" w:cs="Times New Roman"/>
                 <w:kern w:val="0"/>
@@ -18795,11 +18789,12 @@
         <w:tc>
           <w:tcPr>
             <w:tcW w:w="0" w:type="auto"/>
+            <w:vAlign w:val="center"/>
             <w:hideMark/>
           </w:tcPr>
           <w:p>
             <w:pPr>
-              <w:jc w:val="left"/>
+              <w:jc w:val="center"/>
               <w:rPr>
                 <w:rFonts w:eastAsia="Times New Roman" w:cs="Times New Roman"/>
                 <w:kern w:val="0"/>
@@ -18825,11 +18820,12 @@
         <w:tc>
           <w:tcPr>
             <w:tcW w:w="4601" w:type="dxa"/>
+            <w:vAlign w:val="center"/>
             <w:hideMark/>
           </w:tcPr>
           <w:p>
             <w:pPr>
-              <w:jc w:val="left"/>
+              <w:jc w:val="center"/>
               <w:rPr>
                 <w:rFonts w:eastAsia="Times New Roman" w:cs="Times New Roman"/>
                 <w:kern w:val="0"/>
@@ -18950,11 +18946,12 @@
         <w:tc>
           <w:tcPr>
             <w:tcW w:w="0" w:type="auto"/>
+            <w:vAlign w:val="center"/>
             <w:hideMark/>
           </w:tcPr>
           <w:p>
             <w:pPr>
-              <w:jc w:val="left"/>
+              <w:jc w:val="center"/>
               <w:rPr>
                 <w:rFonts w:eastAsia="Times New Roman" w:cs="Times New Roman"/>
                 <w:kern w:val="0"/>
@@ -18980,11 +18977,12 @@
         <w:tc>
           <w:tcPr>
             <w:tcW w:w="0" w:type="auto"/>
+            <w:vAlign w:val="center"/>
             <w:hideMark/>
           </w:tcPr>
           <w:p>
             <w:pPr>
-              <w:jc w:val="left"/>
+              <w:jc w:val="center"/>
               <w:rPr>
                 <w:rFonts w:eastAsia="Times New Roman" w:cs="Times New Roman"/>
                 <w:kern w:val="0"/>
@@ -19058,11 +19056,12 @@
         <w:tc>
           <w:tcPr>
             <w:tcW w:w="4601" w:type="dxa"/>
+            <w:vAlign w:val="center"/>
             <w:hideMark/>
           </w:tcPr>
           <w:p>
             <w:pPr>
-              <w:jc w:val="left"/>
+              <w:jc w:val="center"/>
               <w:rPr>
                 <w:rFonts w:eastAsia="Times New Roman" w:cs="Times New Roman"/>
                 <w:kern w:val="0"/>
@@ -19130,11 +19129,12 @@
         <w:tc>
           <w:tcPr>
             <w:tcW w:w="0" w:type="auto"/>
+            <w:vAlign w:val="center"/>
             <w:hideMark/>
           </w:tcPr>
           <w:p>
             <w:pPr>
-              <w:jc w:val="left"/>
+              <w:jc w:val="center"/>
               <w:rPr>
                 <w:rFonts w:eastAsia="Times New Roman" w:cs="Times New Roman"/>
                 <w:kern w:val="0"/>
@@ -19160,11 +19160,12 @@
         <w:tc>
           <w:tcPr>
             <w:tcW w:w="0" w:type="auto"/>
+            <w:vAlign w:val="center"/>
             <w:hideMark/>
           </w:tcPr>
           <w:p>
             <w:pPr>
-              <w:jc w:val="left"/>
+              <w:jc w:val="center"/>
               <w:rPr>
                 <w:rFonts w:eastAsia="Times New Roman" w:cs="Times New Roman"/>
                 <w:kern w:val="0"/>
@@ -19227,11 +19228,12 @@
         <w:tc>
           <w:tcPr>
             <w:tcW w:w="4601" w:type="dxa"/>
+            <w:vAlign w:val="center"/>
             <w:hideMark/>
           </w:tcPr>
           <w:p>
             <w:pPr>
-              <w:jc w:val="left"/>
+              <w:jc w:val="center"/>
               <w:rPr>
                 <w:rFonts w:eastAsia="Times New Roman" w:cs="Times New Roman"/>
                 <w:kern w:val="0"/>
@@ -30029,11 +30031,16 @@
       <w:r>
         <w:t xml:space="preserve"> </w:t>
       </w:r>
+      <w:proofErr w:type="gramStart"/>
       <w:r>
         <w:t>-</w:t>
       </w:r>
       <w:r>
-        <w:t xml:space="preserve"> это позволяет проверить поведение @</w:t>
+        <w:t xml:space="preserve"> это</w:t>
+      </w:r>
+      <w:proofErr w:type="gramEnd"/>
+      <w:r>
+        <w:t xml:space="preserve"> позволяет проверить поведение @</w:t>
       </w:r>
       <w:proofErr w:type="spellStart"/>
       <w:r>
@@ -34102,9 +34109,6 @@
       <w:pPr>
         <w:pStyle w:val="11"/>
         <w:ind w:firstLine="0"/>
-        <w:rPr>
-          <w:lang w:val="en-US"/>
-        </w:rPr>
       </w:pPr>
       <w:r>
         <w:rPr>
@@ -34112,45 +34116,35 @@
         </w:rPr>
         <w:t>cd</w:t>
       </w:r>
-      <w:r>
-        <w:rPr>
-          <w:lang w:val="en-US"/>
-        </w:rPr>
-        <w:t xml:space="preserve"> ../..</w:t>
-      </w:r>
-    </w:p>
-    <w:p>
-      <w:pPr>
-        <w:pStyle w:val="11"/>
-        <w:rPr>
-          <w:lang w:val="en-US"/>
-        </w:rPr>
+      <w:proofErr w:type="gramStart"/>
+      <w:r>
+        <w:t xml:space="preserve"> ..</w:t>
+      </w:r>
+      <w:proofErr w:type="gramEnd"/>
+      <w:r>
+        <w:t>/..</w:t>
+      </w:r>
+    </w:p>
+    <w:p>
+      <w:pPr>
+        <w:pStyle w:val="11"/>
       </w:pPr>
       <w:r>
         <w:t>Шаг</w:t>
       </w:r>
       <w:r>
-        <w:rPr>
-          <w:lang w:val="en-US"/>
-        </w:rPr>
         <w:t xml:space="preserve"> 5. </w:t>
       </w:r>
       <w:r>
         <w:t>Запуск</w:t>
       </w:r>
       <w:r>
-        <w:rPr>
-          <w:lang w:val="en-US"/>
-        </w:rPr>
         <w:t xml:space="preserve"> </w:t>
       </w:r>
       <w:r>
         <w:t>всех</w:t>
       </w:r>
       <w:r>
-        <w:rPr>
-          <w:lang w:val="en-US"/>
-        </w:rPr>
         <w:t xml:space="preserve"> </w:t>
       </w:r>
       <w:r>
@@ -34177,7 +34171,13 @@
         <w:pStyle w:val="11"/>
       </w:pPr>
       <w:r>
-        <w:t xml:space="preserve">Шаг 6. </w:t>
+        <w:t>Шаг</w:t>
+      </w:r>
+      <w:r>
+        <w:rPr>
+          <w:lang w:val="en-US"/>
+        </w:rPr>
+        <w:t xml:space="preserve"> 6. </w:t>
       </w:r>
       <w:r>
         <w:t>Проверка состояния</w:t>
@@ -36435,27 +36435,14 @@
       <w:r>
         <w:t xml:space="preserve">Рисунок </w:t>
       </w:r>
-      <w:r>
-        <w:fldChar w:fldCharType="begin"/>
-      </w:r>
-      <w:r>
-        <w:instrText xml:space="preserve"> SEQ Рисунок \* ARABIC </w:instrText>
-      </w:r>
-      <w:r>
-        <w:fldChar w:fldCharType="separate"/>
-      </w:r>
-      <w:r>
-        <w:rPr>
-          <w:noProof/>
-        </w:rPr>
-        <w:t>1</w:t>
-      </w:r>
-      <w:r>
-        <w:rPr>
-          <w:noProof/>
-        </w:rPr>
-        <w:fldChar w:fldCharType="end"/>
-      </w:r>
+      <w:fldSimple w:instr=" SEQ Рисунок \* ARABIC ">
+        <w:r>
+          <w:rPr>
+            <w:noProof/>
+          </w:rPr>
+          <w:t>1</w:t>
+        </w:r>
+      </w:fldSimple>
       <w:r>
         <w:t xml:space="preserve"> - диаграмма </w:t>
       </w:r>
@@ -39178,11 +39165,23 @@
           <w:rPr>
             <w:rStyle w:val="a8"/>
           </w:rPr>
-          <w:t>https://github.com/dimain1/LDOE_Helper</w:t>
+          <w:t>https://github.com/dimain1/L</w:t>
+        </w:r>
+        <w:bookmarkStart w:id="73" w:name="_GoBack"/>
+        <w:bookmarkEnd w:id="73"/>
+        <w:r>
+          <w:rPr>
+            <w:rStyle w:val="a8"/>
+          </w:rPr>
+          <w:t>D</w:t>
+        </w:r>
+        <w:r>
+          <w:rPr>
+            <w:rStyle w:val="a8"/>
+          </w:rPr>
+          <w:t>OE_Helper</w:t>
         </w:r>
       </w:hyperlink>
-      <w:bookmarkStart w:id="73" w:name="_GoBack"/>
-      <w:bookmarkEnd w:id="73"/>
       <w:r>
         <w:t xml:space="preserve"> </w:t>
       </w:r>
@@ -45894,6 +45893,7 @@
         <w:t xml:space="preserve"> = dto.</w:t>
       </w:r>
       <w:proofErr w:type="spellStart"/>
+      <w:proofErr w:type="gramStart"/>
       <w:r>
         <w:rPr>
           <w:rFonts w:ascii="Consolas" w:hAnsi="Consolas"/>
@@ -45911,7 +45911,17 @@
           <w:szCs w:val="20"/>
           <w:lang w:val="en-US"/>
         </w:rPr>
-        <w:t xml:space="preserve">?.let { </w:t>
+        <w:t>?.</w:t>
+      </w:r>
+      <w:proofErr w:type="gramEnd"/>
+      <w:r>
+        <w:rPr>
+          <w:rFonts w:ascii="Consolas" w:hAnsi="Consolas"/>
+          <w:sz w:val="20"/>
+          <w:szCs w:val="20"/>
+          <w:lang w:val="en-US"/>
+        </w:rPr>
+        <w:t xml:space="preserve">let { </w:t>
       </w:r>
       <w:proofErr w:type="spellStart"/>
       <w:r>
@@ -47585,7 +47595,27 @@
           <w:szCs w:val="20"/>
           <w:lang w:val="en-US"/>
         </w:rPr>
-        <w:t xml:space="preserve">    override fun authenticate(route: Route?, response: Response): Request? {</w:t>
+        <w:t xml:space="preserve">    override fun authenticate(route: </w:t>
+      </w:r>
+      <w:proofErr w:type="gramStart"/>
+      <w:r>
+        <w:rPr>
+          <w:rFonts w:ascii="Courier New" w:hAnsi="Courier New" w:cs="Courier New"/>
+          <w:sz w:val="20"/>
+          <w:szCs w:val="20"/>
+          <w:lang w:val="en-US"/>
+        </w:rPr>
+        <w:t>Route?,</w:t>
+      </w:r>
+      <w:proofErr w:type="gramEnd"/>
+      <w:r>
+        <w:rPr>
+          <w:rFonts w:ascii="Courier New" w:hAnsi="Courier New" w:cs="Courier New"/>
+          <w:sz w:val="20"/>
+          <w:szCs w:val="20"/>
+          <w:lang w:val="en-US"/>
+        </w:rPr>
+        <w:t xml:space="preserve"> response: Response): Request? {</w:t>
       </w:r>
     </w:p>
     <w:p>
@@ -47945,9 +47975,20 @@
           <w:szCs w:val="20"/>
           <w:lang w:val="en-US"/>
         </w:rPr>
-        <w:t xml:space="preserve">                ?.</w:t>
-      </w:r>
-      <w:proofErr w:type="spellStart"/>
+        <w:t xml:space="preserve">                </w:t>
+      </w:r>
+      <w:proofErr w:type="gramStart"/>
+      <w:r>
+        <w:rPr>
+          <w:rFonts w:ascii="Courier New" w:hAnsi="Courier New" w:cs="Courier New"/>
+          <w:sz w:val="20"/>
+          <w:szCs w:val="20"/>
+          <w:lang w:val="en-US"/>
+        </w:rPr>
+        <w:t>?.</w:t>
+      </w:r>
+      <w:proofErr w:type="spellStart"/>
+      <w:proofErr w:type="gramEnd"/>
       <w:r>
         <w:rPr>
           <w:rFonts w:ascii="Courier New" w:hAnsi="Courier New" w:cs="Courier New"/>
@@ -59073,6 +59114,18 @@
       <w:shd w:val="clear" w:color="auto" w:fill="E1DFDD"/>
     </w:rPr>
   </w:style>
+  <w:style w:type="character" w:styleId="ab">
+    <w:name w:val="FollowedHyperlink"/>
+    <w:basedOn w:val="a0"/>
+    <w:uiPriority w:val="99"/>
+    <w:semiHidden/>
+    <w:unhideWhenUsed/>
+    <w:rsid w:val="00F141E0"/>
+    <w:rPr>
+      <w:color w:val="954F72" w:themeColor="followedHyperlink"/>
+      <w:u w:val="single"/>
+    </w:rPr>
+  </w:style>
 </w:styles>
 </file>
 
@@ -59376,7 +59429,7 @@
 </file>
 
 <file path=customXml/itemProps1.xml><?xml version="1.0" encoding="utf-8"?>
-<ds:datastoreItem xmlns:ds="http://schemas.openxmlformats.org/officeDocument/2006/customXml" ds:itemID="{6EF2949F-077F-402C-96E0-A55823F395E3}">
+<ds:datastoreItem xmlns:ds="http://schemas.openxmlformats.org/officeDocument/2006/customXml" ds:itemID="{26F68B02-B51D-4750-AAEE-0667896B97CE}">
   <ds:schemaRefs>
     <ds:schemaRef ds:uri="http://schemas.openxmlformats.org/officeDocument/2006/bibliography"/>
   </ds:schemaRefs>

</xml_diff>